<commit_message>
Correction erreur de numérotation
</commit_message>
<xml_diff>
--- a/Cours/5eme/SaintExupery/Chapitre_12/Documents/Chapitre 12 - Fraction - Proportion et quotient (A trou).docx
+++ b/Cours/5eme/SaintExupery/Chapitre_12/Documents/Chapitre 12 - Fraction - Proportion et quotient (A trou).docx
@@ -489,7 +489,7 @@
           <w:noProof/>
         </w:rPr>
         <w:drawing>
-          <wp:anchor distT="0" distB="0" distL="114300" distR="114300" simplePos="0" relativeHeight="251660288" behindDoc="0" locked="0" layoutInCell="1" allowOverlap="1" wp14:anchorId="48737B52" wp14:editId="7EAE5D32">
+          <wp:anchor distT="0" distB="0" distL="114300" distR="114300" simplePos="0" relativeHeight="251660288" behindDoc="0" locked="0" layoutInCell="1" allowOverlap="1" wp14:anchorId="48737B52" wp14:editId="4B942752">
             <wp:simplePos x="0" y="0"/>
             <wp:positionH relativeFrom="column">
               <wp:posOffset>4042410</wp:posOffset>
@@ -2719,7 +2719,7 @@
           <w:lang w:eastAsia="fr-FR"/>
         </w:rPr>
         <w:drawing>
-          <wp:inline distT="0" distB="0" distL="0" distR="0" wp14:anchorId="27016086" wp14:editId="32FF13FB">
+          <wp:inline distT="0" distB="0" distL="0" distR="0" wp14:anchorId="27016086" wp14:editId="023F25A7">
             <wp:extent cx="5748655" cy="563212"/>
             <wp:effectExtent l="0" t="0" r="0" b="8890"/>
             <wp:docPr id="33" name="Image 33"/>
@@ -2789,30 +2789,14 @@
           <w:sz w:val="24"/>
           <w:szCs w:val="24"/>
         </w:rPr>
-        <w:t xml:space="preserve">      </w:t>
-      </w:r>
-      <w:proofErr w:type="gramStart"/>
-      <w:r>
-        <w:rPr>
-          <w:sz w:val="24"/>
-          <w:szCs w:val="24"/>
-        </w:rPr>
-        <w:t xml:space="preserve">  </w:t>
+        <w:t xml:space="preserve">        </w:t>
       </w:r>
       <w:r>
         <w:rPr>
           <w:sz w:val="24"/>
           <w:szCs w:val="24"/>
         </w:rPr>
-        <w:t>.</w:t>
-      </w:r>
-      <w:proofErr w:type="gramEnd"/>
-      <w:r>
-        <w:rPr>
-          <w:sz w:val="24"/>
-          <w:szCs w:val="24"/>
-        </w:rPr>
-        <w:t xml:space="preserve"> </w:t>
+        <w:t xml:space="preserve">. </w:t>
       </w:r>
       <w:r>
         <w:rPr>
@@ -2828,16 +2812,7 @@
           <w:sz w:val="24"/>
           <w:szCs w:val="24"/>
         </w:rPr>
-        <w:t xml:space="preserve">      </w:t>
-      </w:r>
-      <w:proofErr w:type="gramStart"/>
-      <w:r>
-        <w:rPr>
-          <w:rFonts w:eastAsiaTheme="minorEastAsia"/>
-          <w:sz w:val="24"/>
-          <w:szCs w:val="24"/>
-        </w:rPr>
-        <w:t xml:space="preserve">  </w:t>
+        <w:t xml:space="preserve">        </w:t>
       </w:r>
       <w:r>
         <w:rPr>
@@ -2847,7 +2822,6 @@
         </w:rPr>
         <w:t>.</w:t>
       </w:r>
-      <w:proofErr w:type="gramEnd"/>
     </w:p>
     <w:p>
       <w:pPr>
@@ -3627,7 +3601,13 @@
       </w:pPr>
       <w:r>
         <w:lastRenderedPageBreak/>
-        <w:t xml:space="preserve">I – </w:t>
+        <w:t>I</w:t>
+      </w:r>
+      <w:r>
+        <w:t>II</w:t>
+      </w:r>
+      <w:r>
+        <w:t xml:space="preserve"> – </w:t>
       </w:r>
       <w:r>
         <w:t xml:space="preserve">Fractions égales </w:t>

</xml_diff>